<commit_message>
Question 11 is done
</commit_message>
<xml_diff>
--- a/HW2Report.docx
+++ b/HW2Report.docx
@@ -120,7 +120,15 @@
         <w:t xml:space="preserve">Q9. </w:t>
       </w:r>
       <w:r>
-        <w:t>Integrate wandb logging</w:t>
+        <w:t xml:space="preserve">Integrate </w:t>
+      </w:r>
+      <w:proofErr w:type="spellStart"/>
+      <w:r>
+        <w:t>wandb</w:t>
+      </w:r>
+      <w:proofErr w:type="spellEnd"/>
+      <w:r>
+        <w:t xml:space="preserve"> logging</w:t>
       </w:r>
     </w:p>
     <w:p>
@@ -172,6 +180,9 @@
     </w:p>
     <w:p>
       <w:r>
+        <w:rPr>
+          <w:noProof/>
+        </w:rPr>
         <w:drawing>
           <wp:inline distT="0" distB="0" distL="0" distR="0" wp14:anchorId="565CF68E" wp14:editId="07F9863A">
             <wp:extent cx="4495800" cy="2838981"/>
@@ -209,6 +220,79 @@
         </w:drawing>
       </w:r>
     </w:p>
+    <w:p>
+      <w:r>
+        <w:lastRenderedPageBreak/>
+        <w:t>Q11.</w:t>
+      </w:r>
+      <w:r>
+        <w:drawing>
+          <wp:inline distT="0" distB="0" distL="0" distR="0" wp14:anchorId="62E2D6CB" wp14:editId="499EAAFE">
+            <wp:extent cx="5943600" cy="2499360"/>
+            <wp:effectExtent l="0" t="0" r="0" b="0"/>
+            <wp:docPr id="2032952369" name="Picture 1"/>
+            <wp:cNvGraphicFramePr>
+              <a:graphicFrameLocks xmlns:a="http://schemas.openxmlformats.org/drawingml/2006/main" noChangeAspect="1"/>
+            </wp:cNvGraphicFramePr>
+            <a:graphic xmlns:a="http://schemas.openxmlformats.org/drawingml/2006/main">
+              <a:graphicData uri="http://schemas.openxmlformats.org/drawingml/2006/picture">
+                <pic:pic xmlns:pic="http://schemas.openxmlformats.org/drawingml/2006/picture">
+                  <pic:nvPicPr>
+                    <pic:cNvPr id="2032952369" name=""/>
+                    <pic:cNvPicPr/>
+                  </pic:nvPicPr>
+                  <pic:blipFill>
+                    <a:blip r:embed="rId8"/>
+                    <a:stretch>
+                      <a:fillRect/>
+                    </a:stretch>
+                  </pic:blipFill>
+                  <pic:spPr>
+                    <a:xfrm>
+                      <a:off x="0" y="0"/>
+                      <a:ext cx="5943600" cy="2499360"/>
+                    </a:xfrm>
+                    <a:prstGeom prst="rect">
+                      <a:avLst/>
+                    </a:prstGeom>
+                  </pic:spPr>
+                </pic:pic>
+              </a:graphicData>
+            </a:graphic>
+          </wp:inline>
+        </w:drawing>
+      </w:r>
+    </w:p>
+    <w:p>
+      <w:r>
+        <w:t xml:space="preserve">In the Graph above you can see when you turn off the residuals, you will get issues with the gradient norm going to zero. </w:t>
+      </w:r>
+      <w:r>
+        <w:t xml:space="preserve">The light blue line just hugs zero all the way down. </w:t>
+      </w:r>
+      <w:r>
+        <w:t>Which cause</w:t>
+      </w:r>
+      <w:r>
+        <w:t>s</w:t>
+      </w:r>
+      <w:r>
+        <w:t xml:space="preserve"> terrible accuracy in the validation set</w:t>
+      </w:r>
+      <w:r>
+        <w:t xml:space="preserve"> during training</w:t>
+      </w:r>
+      <w:r>
+        <w:t>.</w:t>
+      </w:r>
+      <w:r>
+        <w:t xml:space="preserve"> </w:t>
+      </w:r>
+      <w:r>
+        <w:t xml:space="preserve">You can also see with too many layers the accuracy can also get worse if you don’t have enough training data. </w:t>
+      </w:r>
+    </w:p>
+    <w:p/>
     <w:sectPr>
       <w:pgSz w:w="12240" w:h="15840"/>
       <w:pgMar w:top="1440" w:right="1440" w:bottom="1440" w:left="1440" w:header="720" w:footer="720" w:gutter="0"/>

</xml_diff>

<commit_message>
for the collab run
</commit_message>
<xml_diff>
--- a/HW2Report.docx
+++ b/HW2Report.docx
@@ -598,6 +598,9 @@
         <w:ind w:left="360"/>
       </w:pPr>
       <w:r>
+        <w:rPr>
+          <w:noProof/>
+        </w:rPr>
         <w:drawing>
           <wp:inline distT="0" distB="0" distL="0" distR="0" wp14:anchorId="3E85A718" wp14:editId="1F715006">
             <wp:extent cx="2766060" cy="773560"/>
@@ -640,6 +643,9 @@
         <w:ind w:left="360"/>
       </w:pPr>
       <w:r>
+        <w:rPr>
+          <w:noProof/>
+        </w:rPr>
         <w:drawing>
           <wp:inline distT="0" distB="0" distL="0" distR="0" wp14:anchorId="2F1DE172" wp14:editId="32D09CF5">
             <wp:extent cx="5672456" cy="1501140"/>
@@ -682,6 +688,9 @@
         <w:ind w:left="360"/>
       </w:pPr>
       <w:r>
+        <w:rPr>
+          <w:noProof/>
+        </w:rPr>
         <w:lastRenderedPageBreak/>
         <w:drawing>
           <wp:inline distT="0" distB="0" distL="0" distR="0" wp14:anchorId="2DEFBFDE" wp14:editId="0341B0FC">
@@ -725,6 +734,9 @@
         <w:ind w:left="360"/>
       </w:pPr>
       <w:r>
+        <w:rPr>
+          <w:noProof/>
+        </w:rPr>
         <w:drawing>
           <wp:inline distT="0" distB="0" distL="0" distR="0" wp14:anchorId="45032A4E" wp14:editId="257AC309">
             <wp:extent cx="4511431" cy="2179509"/>
@@ -750,6 +762,234 @@
                     <a:xfrm>
                       <a:off x="0" y="0"/>
                       <a:ext cx="4511431" cy="2179509"/>
+                    </a:xfrm>
+                    <a:prstGeom prst="rect">
+                      <a:avLst/>
+                    </a:prstGeom>
+                  </pic:spPr>
+                </pic:pic>
+              </a:graphicData>
+            </a:graphic>
+          </wp:inline>
+        </w:drawing>
+      </w:r>
+    </w:p>
+    <w:p>
+      <w:pPr>
+        <w:ind w:left="360"/>
+      </w:pPr>
+      <w:r>
+        <w:t>Q20.</w:t>
+      </w:r>
+      <w:r>
+        <w:t xml:space="preserve"> Here is the accuracy and training for the attention patterns.</w:t>
+      </w:r>
+    </w:p>
+    <w:p>
+      <w:pPr>
+        <w:ind w:left="360"/>
+      </w:pPr>
+    </w:p>
+    <w:p>
+      <w:pPr>
+        <w:ind w:left="360"/>
+      </w:pPr>
+      <w:r>
+        <w:drawing>
+          <wp:inline distT="0" distB="0" distL="0" distR="0" wp14:anchorId="2960B065" wp14:editId="4B949809">
+            <wp:extent cx="5943600" cy="2566670"/>
+            <wp:effectExtent l="0" t="0" r="0" b="5080"/>
+            <wp:docPr id="944172903" name="Picture 1"/>
+            <wp:cNvGraphicFramePr>
+              <a:graphicFrameLocks xmlns:a="http://schemas.openxmlformats.org/drawingml/2006/main" noChangeAspect="1"/>
+            </wp:cNvGraphicFramePr>
+            <a:graphic xmlns:a="http://schemas.openxmlformats.org/drawingml/2006/main">
+              <a:graphicData uri="http://schemas.openxmlformats.org/drawingml/2006/picture">
+                <pic:pic xmlns:pic="http://schemas.openxmlformats.org/drawingml/2006/picture">
+                  <pic:nvPicPr>
+                    <pic:cNvPr id="944172903" name=""/>
+                    <pic:cNvPicPr/>
+                  </pic:nvPicPr>
+                  <pic:blipFill>
+                    <a:blip r:embed="rId19"/>
+                    <a:stretch>
+                      <a:fillRect/>
+                    </a:stretch>
+                  </pic:blipFill>
+                  <pic:spPr>
+                    <a:xfrm>
+                      <a:off x="0" y="0"/>
+                      <a:ext cx="5943600" cy="2566670"/>
+                    </a:xfrm>
+                    <a:prstGeom prst="rect">
+                      <a:avLst/>
+                    </a:prstGeom>
+                  </pic:spPr>
+                </pic:pic>
+              </a:graphicData>
+            </a:graphic>
+          </wp:inline>
+        </w:drawing>
+      </w:r>
+    </w:p>
+    <w:p>
+      <w:pPr>
+        <w:ind w:left="360"/>
+      </w:pPr>
+      <w:r>
+        <w:lastRenderedPageBreak/>
+        <w:drawing>
+          <wp:inline distT="0" distB="0" distL="0" distR="0" wp14:anchorId="0F347BDE" wp14:editId="6D4DA83F">
+            <wp:extent cx="5943600" cy="2479040"/>
+            <wp:effectExtent l="0" t="0" r="0" b="0"/>
+            <wp:docPr id="1370765234" name="Picture 1"/>
+            <wp:cNvGraphicFramePr>
+              <a:graphicFrameLocks xmlns:a="http://schemas.openxmlformats.org/drawingml/2006/main" noChangeAspect="1"/>
+            </wp:cNvGraphicFramePr>
+            <a:graphic xmlns:a="http://schemas.openxmlformats.org/drawingml/2006/main">
+              <a:graphicData uri="http://schemas.openxmlformats.org/drawingml/2006/picture">
+                <pic:pic xmlns:pic="http://schemas.openxmlformats.org/drawingml/2006/picture">
+                  <pic:nvPicPr>
+                    <pic:cNvPr id="1370765234" name=""/>
+                    <pic:cNvPicPr/>
+                  </pic:nvPicPr>
+                  <pic:blipFill>
+                    <a:blip r:embed="rId20"/>
+                    <a:stretch>
+                      <a:fillRect/>
+                    </a:stretch>
+                  </pic:blipFill>
+                  <pic:spPr>
+                    <a:xfrm>
+                      <a:off x="0" y="0"/>
+                      <a:ext cx="5943600" cy="2479040"/>
+                    </a:xfrm>
+                    <a:prstGeom prst="rect">
+                      <a:avLst/>
+                    </a:prstGeom>
+                  </pic:spPr>
+                </pic:pic>
+              </a:graphicData>
+            </a:graphic>
+          </wp:inline>
+        </w:drawing>
+      </w:r>
+    </w:p>
+    <w:p>
+      <w:pPr>
+        <w:ind w:left="360"/>
+      </w:pPr>
+    </w:p>
+    <w:p>
+      <w:pPr>
+        <w:ind w:left="360"/>
+      </w:pPr>
+      <w:r>
+        <w:t xml:space="preserve">Here it looks like the word “on” attends to sitzt, auf, den, and schultem. Boy also has a bunch of German words it attends to. </w:t>
+      </w:r>
+    </w:p>
+    <w:p>
+      <w:pPr>
+        <w:ind w:left="360"/>
+      </w:pPr>
+      <w:r>
+        <w:drawing>
+          <wp:inline distT="0" distB="0" distL="0" distR="0" wp14:anchorId="76B2043A" wp14:editId="7322E286">
+            <wp:extent cx="5146339" cy="4648200"/>
+            <wp:effectExtent l="0" t="0" r="0" b="0"/>
+            <wp:docPr id="329852261" name="Picture 1"/>
+            <wp:cNvGraphicFramePr>
+              <a:graphicFrameLocks xmlns:a="http://schemas.openxmlformats.org/drawingml/2006/main" noChangeAspect="1"/>
+            </wp:cNvGraphicFramePr>
+            <a:graphic xmlns:a="http://schemas.openxmlformats.org/drawingml/2006/main">
+              <a:graphicData uri="http://schemas.openxmlformats.org/drawingml/2006/picture">
+                <pic:pic xmlns:pic="http://schemas.openxmlformats.org/drawingml/2006/picture">
+                  <pic:nvPicPr>
+                    <pic:cNvPr id="329852261" name=""/>
+                    <pic:cNvPicPr/>
+                  </pic:nvPicPr>
+                  <pic:blipFill>
+                    <a:blip r:embed="rId21"/>
+                    <a:stretch>
+                      <a:fillRect/>
+                    </a:stretch>
+                  </pic:blipFill>
+                  <pic:spPr>
+                    <a:xfrm>
+                      <a:off x="0" y="0"/>
+                      <a:ext cx="5154812" cy="4655853"/>
+                    </a:xfrm>
+                    <a:prstGeom prst="rect">
+                      <a:avLst/>
+                    </a:prstGeom>
+                  </pic:spPr>
+                </pic:pic>
+              </a:graphicData>
+            </a:graphic>
+          </wp:inline>
+        </w:drawing>
+      </w:r>
+    </w:p>
+    <w:p>
+      <w:pPr>
+        <w:ind w:left="360"/>
+      </w:pPr>
+      <w:r>
+        <w:lastRenderedPageBreak/>
+        <w:t xml:space="preserve">It is interesting that </w:t>
+      </w:r>
+      <w:r>
+        <w:t>“</w:t>
+      </w:r>
+      <w:r>
+        <w:t>,</w:t>
+      </w:r>
+      <w:r>
+        <w:t>”</w:t>
+      </w:r>
+      <w:r>
+        <w:t xml:space="preserve"> </w:t>
+      </w:r>
+      <w:r>
+        <w:t>attends across the board. “She” is also pretty wide, and the color cuts out and comes back. Probably do to referencing her</w:t>
+      </w:r>
+      <w:r>
+        <w:t xml:space="preserve"> later in the sentince</w:t>
+      </w:r>
+      <w:r>
+        <w:t xml:space="preserve">. </w:t>
+      </w:r>
+    </w:p>
+    <w:p>
+      <w:pPr>
+        <w:ind w:left="360"/>
+      </w:pPr>
+      <w:r>
+        <w:drawing>
+          <wp:inline distT="0" distB="0" distL="0" distR="0" wp14:anchorId="053380F2" wp14:editId="054195E9">
+            <wp:extent cx="5943600" cy="3576955"/>
+            <wp:effectExtent l="0" t="0" r="0" b="4445"/>
+            <wp:docPr id="977991241" name="Picture 1"/>
+            <wp:cNvGraphicFramePr>
+              <a:graphicFrameLocks xmlns:a="http://schemas.openxmlformats.org/drawingml/2006/main" noChangeAspect="1"/>
+            </wp:cNvGraphicFramePr>
+            <a:graphic xmlns:a="http://schemas.openxmlformats.org/drawingml/2006/main">
+              <a:graphicData uri="http://schemas.openxmlformats.org/drawingml/2006/picture">
+                <pic:pic xmlns:pic="http://schemas.openxmlformats.org/drawingml/2006/picture">
+                  <pic:nvPicPr>
+                    <pic:cNvPr id="977991241" name=""/>
+                    <pic:cNvPicPr/>
+                  </pic:nvPicPr>
+                  <pic:blipFill>
+                    <a:blip r:embed="rId22"/>
+                    <a:stretch>
+                      <a:fillRect/>
+                    </a:stretch>
+                  </pic:blipFill>
+                  <pic:spPr>
+                    <a:xfrm>
+                      <a:off x="0" y="0"/>
+                      <a:ext cx="5943600" cy="3576955"/>
                     </a:xfrm>
                     <a:prstGeom prst="rect">
                       <a:avLst/>

</xml_diff>